<commit_message>
docs(rncp): numérotation des pages du dossier Bloc 2
Co-Authored-By: Claude Fable 5 <noreply@anthropic.com>
</commit_message>
<xml_diff>
--- a/dossier/Dossier_Bloc2_Albion_Helper.docx
+++ b/dossier/Dossier_Bloc2_Albion_Helper.docx
@@ -9498,6 +9498,7 @@
       </w:r>
     </w:p>
     <w:sectPr>
+      <w:footerReference w:type="default" r:id="rId17"/>
       <w:pgSz w:w="12240" w:h="15840"/>
       <w:pgMar w:top="1134" w:right="1247" w:bottom="1134" w:left="1247" w:header="720" w:footer="720" w:gutter="0"/>
       <w:cols w:space="720"/>
@@ -9505,6 +9506,24 @@
     </w:sectPr>
   </w:body>
 </w:document>
+</file>
+
+<file path=word/footer1.xml><?xml version="1.0" encoding="utf-8"?>
+<w:ftr xmlns:m="http://schemas.openxmlformats.org/officeDocument/2006/math" xmlns:mc="http://schemas.openxmlformats.org/markup-compatibility/2006" xmlns:mo="http://schemas.microsoft.com/office/mac/office/2008/main" xmlns:mv="urn:schemas-microsoft-com:mac:vml" xmlns:o="urn:schemas-microsoft-com:office:office" xmlns:r="http://schemas.openxmlformats.org/officeDocument/2006/relationships" xmlns:v="urn:schemas-microsoft-com:vml" xmlns:w10="urn:schemas-microsoft-com:office:word" xmlns:w14="http://schemas.microsoft.com/office/word/2010/wordml" xmlns:w="http://schemas.openxmlformats.org/wordprocessingml/2006/main" xmlns:wne="http://schemas.microsoft.com/office/word/2006/wordml" xmlns:wp14="http://schemas.microsoft.com/office/word/2010/wordprocessingDrawing" xmlns:wp="http://schemas.openxmlformats.org/drawingml/2006/wordprocessingDrawing" xmlns:wpc="http://schemas.microsoft.com/office/word/2010/wordprocessingCanvas" xmlns:wpg="http://schemas.microsoft.com/office/word/2010/wordprocessingGroup" xmlns:wpi="http://schemas.microsoft.com/office/word/2010/wordprocessingInk" xmlns:wps="http://schemas.microsoft.com/office/word/2010/wordprocessingShape" mc:Ignorable="w14 wp14">
+  <w:p>
+    <w:pPr>
+      <w:pStyle w:val="Footer"/>
+      <w:jc w:val="center"/>
+    </w:pPr>
+    <w:r>
+      <w:rPr>
+        <w:sz w:val="17"/>
+      </w:rPr>
+      <w:t xml:space="preserve">Albion Helper — Dossier Bloc 2 — RNCP39583 — page </w:t>
+    </w:r>
+    <w:fldSimple w:instr="PAGE"/>
+  </w:p>
+</w:ftr>
 </file>
 
 <file path=word/numbering.xml><?xml version="1.0" encoding="utf-8"?>

</xml_diff>